<commit_message>
Add security requirements document and tidy project documents
Add the security requirements document (docx and pdf). Clean up the formatting of the SRS, test plan and use case flow, add PDF copies, redraw the use case diagram, and remove the duplicate UseCaseFlow.pages file.
</commit_message>
<xml_diff>
--- a/Documents/SRS_Online_Bookstore.docx
+++ b/Documents/SRS_Online_Bookstore.docx
@@ -111,18 +111,22 @@
     </w:p>
     <w:tbl>
       <w:tblPr>
+        <w:tblStyle w:val="TableGrid"/>
         <w:tblW w:w="9400" w:type="dxa"/>
         <w:tblBorders>
-          <w:top w:val="single" w:sz="4" w:space="0" w:color="auto"/>
-          <w:left w:val="single" w:sz="4" w:space="0" w:color="auto"/>
-          <w:bottom w:val="single" w:sz="4" w:space="0" w:color="auto"/>
-          <w:right w:val="single" w:sz="4" w:space="0" w:color="auto"/>
-          <w:insideH w:val="single" w:sz="4" w:space="0" w:color="auto"/>
-          <w:insideV w:val="single" w:sz="4" w:space="0" w:color="auto"/>
+          <w:top w:val="single" w:sz="6" w:space="0" w:color="000000"/>
+          <w:left w:val="single" w:sz="6" w:space="0" w:color="000000"/>
+          <w:bottom w:val="single" w:sz="6" w:space="0" w:color="000000"/>
+          <w:right w:val="single" w:sz="6" w:space="0" w:color="000000"/>
+          <w:insideH w:val="single" w:sz="6" w:space="0" w:color="000000"/>
+          <w:insideV w:val="single" w:sz="6" w:space="0" w:color="000000"/>
         </w:tblBorders>
+        <w:tblLayout w:type="fixed"/>
         <w:tblCellMar>
-          <w:left w:w="10" w:type="dxa"/>
-          <w:right w:w="10" w:type="dxa"/>
+          <w:top w:w="60" w:type="dxa"/>
+          <w:left w:w="100" w:type="dxa"/>
+          <w:bottom w:w="60" w:type="dxa"/>
+          <w:right w:w="100" w:type="dxa"/>
         </w:tblCellMar>
         <w:tblLook w:val="0000" w:firstRow="0" w:lastRow="0" w:firstColumn="0" w:lastColumn="0" w:noHBand="0" w:noVBand="0"/>
       </w:tblPr>
@@ -138,21 +142,18 @@
           </w:tblCellMar>
         </w:tblPrEx>
         <w:trPr>
+          <w:cantSplit/>
           <w:tblHeader/>
         </w:trPr>
         <w:tc>
           <w:tcPr>
             <w:tcW w:w="1400" w:type="dxa"/>
-            <w:tcMar>
-              <w:top w:w="80" w:type="dxa"/>
-              <w:left w:w="100" w:type="dxa"/>
-              <w:bottom w:w="80" w:type="dxa"/>
-              <w:right w:w="100" w:type="dxa"/>
-            </w:tcMar>
-            <w:vAlign w:val="center"/>
-          </w:tcPr>
-          <w:p>
-            <w:pPr>
+            <w:shd w:val="clear" w:color="auto" w:fill="D9D9D9"/>
+            <w:vAlign w:val="center"/>
+          </w:tcPr>
+          <w:p>
+            <w:pPr>
+              <w:spacing w:before="0" w:after="0" w:line="240" w:lineRule="auto"/>
               <w:jc w:val="center"/>
             </w:pPr>
             <w:r>
@@ -167,16 +168,12 @@
         <w:tc>
           <w:tcPr>
             <w:tcW w:w="8000" w:type="dxa"/>
-            <w:tcMar>
-              <w:top w:w="80" w:type="dxa"/>
-              <w:left w:w="100" w:type="dxa"/>
-              <w:bottom w:w="80" w:type="dxa"/>
-              <w:right w:w="100" w:type="dxa"/>
-            </w:tcMar>
-            <w:vAlign w:val="center"/>
-          </w:tcPr>
-          <w:p>
-            <w:pPr>
+            <w:shd w:val="clear" w:color="auto" w:fill="D9D9D9"/>
+            <w:vAlign w:val="center"/>
+          </w:tcPr>
+          <w:p>
+            <w:pPr>
+              <w:spacing w:before="0" w:after="0" w:line="240" w:lineRule="auto"/>
               <w:jc w:val="center"/>
             </w:pPr>
             <w:r>
@@ -196,19 +193,17 @@
             <w:bottom w:w="0" w:type="dxa"/>
           </w:tblCellMar>
         </w:tblPrEx>
+        <w:trPr>
+          <w:cantSplit/>
+        </w:trPr>
         <w:tc>
           <w:tcPr>
             <w:tcW w:w="1400" w:type="dxa"/>
-            <w:tcMar>
-              <w:top w:w="80" w:type="dxa"/>
-              <w:left w:w="100" w:type="dxa"/>
-              <w:bottom w:w="80" w:type="dxa"/>
-              <w:right w:w="100" w:type="dxa"/>
-            </w:tcMar>
-            <w:vAlign w:val="center"/>
-          </w:tcPr>
-          <w:p>
-            <w:pPr>
+            <w:vAlign w:val="center"/>
+          </w:tcPr>
+          <w:p>
+            <w:pPr>
+              <w:spacing w:before="0" w:after="0" w:line="240" w:lineRule="auto"/>
               <w:jc w:val="center"/>
             </w:pPr>
             <w:r>
@@ -223,15 +218,12 @@
         <w:tc>
           <w:tcPr>
             <w:tcW w:w="8000" w:type="dxa"/>
-            <w:tcMar>
-              <w:top w:w="80" w:type="dxa"/>
-              <w:left w:w="100" w:type="dxa"/>
-              <w:bottom w:w="80" w:type="dxa"/>
-              <w:right w:w="100" w:type="dxa"/>
-            </w:tcMar>
-            <w:vAlign w:val="center"/>
-          </w:tcPr>
-          <w:p>
+            <w:vAlign w:val="center"/>
+          </w:tcPr>
+          <w:p>
+            <w:pPr>
+              <w:spacing w:before="0" w:after="0" w:line="240" w:lineRule="auto"/>
+            </w:pPr>
             <w:r>
               <w:t>Allow users to register and log in using email/phone with password authentication.</w:t>
             </w:r>
@@ -245,19 +237,17 @@
             <w:bottom w:w="0" w:type="dxa"/>
           </w:tblCellMar>
         </w:tblPrEx>
+        <w:trPr>
+          <w:cantSplit/>
+        </w:trPr>
         <w:tc>
           <w:tcPr>
             <w:tcW w:w="1400" w:type="dxa"/>
-            <w:tcMar>
-              <w:top w:w="80" w:type="dxa"/>
-              <w:left w:w="100" w:type="dxa"/>
-              <w:bottom w:w="80" w:type="dxa"/>
-              <w:right w:w="100" w:type="dxa"/>
-            </w:tcMar>
-            <w:vAlign w:val="center"/>
-          </w:tcPr>
-          <w:p>
-            <w:pPr>
+            <w:vAlign w:val="center"/>
+          </w:tcPr>
+          <w:p>
+            <w:pPr>
+              <w:spacing w:before="0" w:after="0" w:line="240" w:lineRule="auto"/>
               <w:jc w:val="center"/>
             </w:pPr>
             <w:r>
@@ -272,15 +262,12 @@
         <w:tc>
           <w:tcPr>
             <w:tcW w:w="8000" w:type="dxa"/>
-            <w:tcMar>
-              <w:top w:w="80" w:type="dxa"/>
-              <w:left w:w="100" w:type="dxa"/>
-              <w:bottom w:w="80" w:type="dxa"/>
-              <w:right w:w="100" w:type="dxa"/>
-            </w:tcMar>
-            <w:vAlign w:val="center"/>
-          </w:tcPr>
-          <w:p>
+            <w:vAlign w:val="center"/>
+          </w:tcPr>
+          <w:p>
+            <w:pPr>
+              <w:spacing w:before="0" w:after="0" w:line="240" w:lineRule="auto"/>
+            </w:pPr>
             <w:r>
               <w:t>Allow buyers to search books by title, author, ISBN, genre, and price range.</w:t>
             </w:r>
@@ -294,19 +281,17 @@
             <w:bottom w:w="0" w:type="dxa"/>
           </w:tblCellMar>
         </w:tblPrEx>
+        <w:trPr>
+          <w:cantSplit/>
+        </w:trPr>
         <w:tc>
           <w:tcPr>
             <w:tcW w:w="1400" w:type="dxa"/>
-            <w:tcMar>
-              <w:top w:w="80" w:type="dxa"/>
-              <w:left w:w="100" w:type="dxa"/>
-              <w:bottom w:w="80" w:type="dxa"/>
-              <w:right w:w="100" w:type="dxa"/>
-            </w:tcMar>
-            <w:vAlign w:val="center"/>
-          </w:tcPr>
-          <w:p>
-            <w:pPr>
+            <w:vAlign w:val="center"/>
+          </w:tcPr>
+          <w:p>
+            <w:pPr>
+              <w:spacing w:before="0" w:after="0" w:line="240" w:lineRule="auto"/>
               <w:jc w:val="center"/>
             </w:pPr>
             <w:r>
@@ -321,15 +306,12 @@
         <w:tc>
           <w:tcPr>
             <w:tcW w:w="8000" w:type="dxa"/>
-            <w:tcMar>
-              <w:top w:w="80" w:type="dxa"/>
-              <w:left w:w="100" w:type="dxa"/>
-              <w:bottom w:w="80" w:type="dxa"/>
-              <w:right w:w="100" w:type="dxa"/>
-            </w:tcMar>
-            <w:vAlign w:val="center"/>
-          </w:tcPr>
-          <w:p>
+            <w:vAlign w:val="center"/>
+          </w:tcPr>
+          <w:p>
+            <w:pPr>
+              <w:spacing w:before="0" w:after="0" w:line="240" w:lineRule="auto"/>
+            </w:pPr>
             <w:r>
               <w:t>Display book details including price, availability, seller, condition, and reviews.</w:t>
             </w:r>
@@ -343,19 +325,17 @@
             <w:bottom w:w="0" w:type="dxa"/>
           </w:tblCellMar>
         </w:tblPrEx>
+        <w:trPr>
+          <w:cantSplit/>
+        </w:trPr>
         <w:tc>
           <w:tcPr>
             <w:tcW w:w="1400" w:type="dxa"/>
-            <w:tcMar>
-              <w:top w:w="80" w:type="dxa"/>
-              <w:left w:w="100" w:type="dxa"/>
-              <w:bottom w:w="80" w:type="dxa"/>
-              <w:right w:w="100" w:type="dxa"/>
-            </w:tcMar>
-            <w:vAlign w:val="center"/>
-          </w:tcPr>
-          <w:p>
-            <w:pPr>
+            <w:vAlign w:val="center"/>
+          </w:tcPr>
+          <w:p>
+            <w:pPr>
+              <w:spacing w:before="0" w:after="0" w:line="240" w:lineRule="auto"/>
               <w:jc w:val="center"/>
             </w:pPr>
             <w:r>
@@ -370,15 +350,12 @@
         <w:tc>
           <w:tcPr>
             <w:tcW w:w="8000" w:type="dxa"/>
-            <w:tcMar>
-              <w:top w:w="80" w:type="dxa"/>
-              <w:left w:w="100" w:type="dxa"/>
-              <w:bottom w:w="80" w:type="dxa"/>
-              <w:right w:w="100" w:type="dxa"/>
-            </w:tcMar>
-            <w:vAlign w:val="center"/>
-          </w:tcPr>
-          <w:p>
+            <w:vAlign w:val="center"/>
+          </w:tcPr>
+          <w:p>
+            <w:pPr>
+              <w:spacing w:before="0" w:after="0" w:line="240" w:lineRule="auto"/>
+            </w:pPr>
             <w:r>
               <w:t>Allow buyers to add/remove items from a shopping cart.</w:t>
             </w:r>
@@ -392,39 +369,41 @@
             <w:bottom w:w="0" w:type="dxa"/>
           </w:tblCellMar>
         </w:tblPrEx>
+        <w:trPr>
+          <w:cantSplit/>
+        </w:trPr>
         <w:tc>
           <w:tcPr>
             <w:tcW w:w="1400" w:type="dxa"/>
-            <w:tcMar>
-              <w:top w:w="80" w:type="dxa"/>
-              <w:left w:w="100" w:type="dxa"/>
-              <w:bottom w:w="80" w:type="dxa"/>
-              <w:right w:w="100" w:type="dxa"/>
-            </w:tcMar>
-            <w:vAlign w:val="center"/>
-          </w:tcPr>
-          <w:p>
-            <w:pPr>
-              <w:jc w:val="center"/>
-              <w:rPr>
-                <w:b/>
-                <w:bCs/>
-              </w:rPr>
-            </w:pPr>
+            <w:vAlign w:val="center"/>
+          </w:tcPr>
+          <w:p>
+            <w:pPr>
+              <w:spacing w:before="0" w:after="0" w:line="240" w:lineRule="auto"/>
+              <w:jc w:val="center"/>
+            </w:pPr>
+            <w:r>
+              <w:rPr>
+                <w:b/>
+                <w:bCs/>
+              </w:rPr>
+              <w:t>FR-5</w:t>
+            </w:r>
           </w:p>
         </w:tc>
         <w:tc>
           <w:tcPr>
             <w:tcW w:w="8000" w:type="dxa"/>
-            <w:tcMar>
-              <w:top w:w="80" w:type="dxa"/>
-              <w:left w:w="100" w:type="dxa"/>
-              <w:bottom w:w="80" w:type="dxa"/>
-              <w:right w:w="100" w:type="dxa"/>
-            </w:tcMar>
-            <w:vAlign w:val="center"/>
-          </w:tcPr>
-          <w:p/>
+            <w:vAlign w:val="center"/>
+          </w:tcPr>
+          <w:p>
+            <w:pPr>
+              <w:spacing w:before="0" w:after="0" w:line="240" w:lineRule="auto"/>
+            </w:pPr>
+            <w:r>
+              <w:t>Allow buyers to place an order and complete payment through an integrated payment gateway.</w:t>
+            </w:r>
+          </w:p>
         </w:tc>
       </w:tr>
       <w:tr>
@@ -434,44 +413,39 @@
             <w:bottom w:w="0" w:type="dxa"/>
           </w:tblCellMar>
         </w:tblPrEx>
+        <w:trPr>
+          <w:cantSplit/>
+        </w:trPr>
         <w:tc>
           <w:tcPr>
             <w:tcW w:w="1400" w:type="dxa"/>
-            <w:tcMar>
-              <w:top w:w="80" w:type="dxa"/>
-              <w:left w:w="100" w:type="dxa"/>
-              <w:bottom w:w="80" w:type="dxa"/>
-              <w:right w:w="100" w:type="dxa"/>
-            </w:tcMar>
-            <w:vAlign w:val="center"/>
-          </w:tcPr>
-          <w:p>
-            <w:pPr>
-              <w:jc w:val="center"/>
-            </w:pPr>
-            <w:r>
-              <w:rPr>
-                <w:b/>
-                <w:bCs/>
-              </w:rPr>
-              <w:t>FR-5</w:t>
+            <w:vAlign w:val="center"/>
+          </w:tcPr>
+          <w:p>
+            <w:pPr>
+              <w:spacing w:before="0" w:after="0" w:line="240" w:lineRule="auto"/>
+              <w:jc w:val="center"/>
+            </w:pPr>
+            <w:r>
+              <w:rPr>
+                <w:b/>
+                <w:bCs/>
+              </w:rPr>
+              <w:t>FR-6</w:t>
             </w:r>
           </w:p>
         </w:tc>
         <w:tc>
           <w:tcPr>
             <w:tcW w:w="8000" w:type="dxa"/>
-            <w:tcMar>
-              <w:top w:w="80" w:type="dxa"/>
-              <w:left w:w="100" w:type="dxa"/>
-              <w:bottom w:w="80" w:type="dxa"/>
-              <w:right w:w="100" w:type="dxa"/>
-            </w:tcMar>
-            <w:vAlign w:val="center"/>
-          </w:tcPr>
-          <w:p>
-            <w:r>
-              <w:t>Allow buyers to place an order and complete payment through an integrated payment gateway.</w:t>
+            <w:vAlign w:val="center"/>
+          </w:tcPr>
+          <w:p>
+            <w:pPr>
+              <w:spacing w:before="0" w:after="0" w:line="240" w:lineRule="auto"/>
+            </w:pPr>
+            <w:r>
+              <w:t>Send a confirmation email/notification whenever an order is placed.</w:t>
             </w:r>
           </w:p>
         </w:tc>
@@ -483,44 +457,39 @@
             <w:bottom w:w="0" w:type="dxa"/>
           </w:tblCellMar>
         </w:tblPrEx>
+        <w:trPr>
+          <w:cantSplit/>
+        </w:trPr>
         <w:tc>
           <w:tcPr>
             <w:tcW w:w="1400" w:type="dxa"/>
-            <w:tcMar>
-              <w:top w:w="80" w:type="dxa"/>
-              <w:left w:w="100" w:type="dxa"/>
-              <w:bottom w:w="80" w:type="dxa"/>
-              <w:right w:w="100" w:type="dxa"/>
-            </w:tcMar>
-            <w:vAlign w:val="center"/>
-          </w:tcPr>
-          <w:p>
-            <w:pPr>
-              <w:jc w:val="center"/>
-            </w:pPr>
-            <w:r>
-              <w:rPr>
-                <w:b/>
-                <w:bCs/>
-              </w:rPr>
-              <w:t>FR-6</w:t>
+            <w:vAlign w:val="center"/>
+          </w:tcPr>
+          <w:p>
+            <w:pPr>
+              <w:spacing w:before="0" w:after="0" w:line="240" w:lineRule="auto"/>
+              <w:jc w:val="center"/>
+            </w:pPr>
+            <w:r>
+              <w:rPr>
+                <w:b/>
+                <w:bCs/>
+              </w:rPr>
+              <w:t>FR-7</w:t>
             </w:r>
           </w:p>
         </w:tc>
         <w:tc>
           <w:tcPr>
             <w:tcW w:w="8000" w:type="dxa"/>
-            <w:tcMar>
-              <w:top w:w="80" w:type="dxa"/>
-              <w:left w:w="100" w:type="dxa"/>
-              <w:bottom w:w="80" w:type="dxa"/>
-              <w:right w:w="100" w:type="dxa"/>
-            </w:tcMar>
-            <w:vAlign w:val="center"/>
-          </w:tcPr>
-          <w:p>
-            <w:r>
-              <w:t>Send a confirmation email/notification whenever an order is placed.</w:t>
+            <w:vAlign w:val="center"/>
+          </w:tcPr>
+          <w:p>
+            <w:pPr>
+              <w:spacing w:before="0" w:after="0" w:line="240" w:lineRule="auto"/>
+            </w:pPr>
+            <w:r>
+              <w:t>Allow sellers to add, edit, and remove book listings.</w:t>
             </w:r>
           </w:p>
         </w:tc>
@@ -532,44 +501,39 @@
             <w:bottom w:w="0" w:type="dxa"/>
           </w:tblCellMar>
         </w:tblPrEx>
+        <w:trPr>
+          <w:cantSplit/>
+        </w:trPr>
         <w:tc>
           <w:tcPr>
             <w:tcW w:w="1400" w:type="dxa"/>
-            <w:tcMar>
-              <w:top w:w="80" w:type="dxa"/>
-              <w:left w:w="100" w:type="dxa"/>
-              <w:bottom w:w="80" w:type="dxa"/>
-              <w:right w:w="100" w:type="dxa"/>
-            </w:tcMar>
-            <w:vAlign w:val="center"/>
-          </w:tcPr>
-          <w:p>
-            <w:pPr>
-              <w:jc w:val="center"/>
-            </w:pPr>
-            <w:r>
-              <w:rPr>
-                <w:b/>
-                <w:bCs/>
-              </w:rPr>
-              <w:t>FR-7</w:t>
+            <w:vAlign w:val="center"/>
+          </w:tcPr>
+          <w:p>
+            <w:pPr>
+              <w:spacing w:before="0" w:after="0" w:line="240" w:lineRule="auto"/>
+              <w:jc w:val="center"/>
+            </w:pPr>
+            <w:r>
+              <w:rPr>
+                <w:b/>
+                <w:bCs/>
+              </w:rPr>
+              <w:t>FR-8</w:t>
             </w:r>
           </w:p>
         </w:tc>
         <w:tc>
           <w:tcPr>
             <w:tcW w:w="8000" w:type="dxa"/>
-            <w:tcMar>
-              <w:top w:w="80" w:type="dxa"/>
-              <w:left w:w="100" w:type="dxa"/>
-              <w:bottom w:w="80" w:type="dxa"/>
-              <w:right w:w="100" w:type="dxa"/>
-            </w:tcMar>
-            <w:vAlign w:val="center"/>
-          </w:tcPr>
-          <w:p>
-            <w:r>
-              <w:t>Allow sellers to add, edit, and remove book listings.</w:t>
+            <w:vAlign w:val="center"/>
+          </w:tcPr>
+          <w:p>
+            <w:pPr>
+              <w:spacing w:before="0" w:after="0" w:line="240" w:lineRule="auto"/>
+            </w:pPr>
+            <w:r>
+              <w:t>Allow sellers to view and manage incoming orders for their listings.</w:t>
             </w:r>
           </w:p>
         </w:tc>
@@ -581,44 +545,39 @@
             <w:bottom w:w="0" w:type="dxa"/>
           </w:tblCellMar>
         </w:tblPrEx>
+        <w:trPr>
+          <w:cantSplit/>
+        </w:trPr>
         <w:tc>
           <w:tcPr>
             <w:tcW w:w="1400" w:type="dxa"/>
-            <w:tcMar>
-              <w:top w:w="80" w:type="dxa"/>
-              <w:left w:w="100" w:type="dxa"/>
-              <w:bottom w:w="80" w:type="dxa"/>
-              <w:right w:w="100" w:type="dxa"/>
-            </w:tcMar>
-            <w:vAlign w:val="center"/>
-          </w:tcPr>
-          <w:p>
-            <w:pPr>
-              <w:jc w:val="center"/>
-            </w:pPr>
-            <w:r>
-              <w:rPr>
-                <w:b/>
-                <w:bCs/>
-              </w:rPr>
-              <w:t>FR-8</w:t>
+            <w:vAlign w:val="center"/>
+          </w:tcPr>
+          <w:p>
+            <w:pPr>
+              <w:spacing w:before="0" w:after="0" w:line="240" w:lineRule="auto"/>
+              <w:jc w:val="center"/>
+            </w:pPr>
+            <w:r>
+              <w:rPr>
+                <w:b/>
+                <w:bCs/>
+              </w:rPr>
+              <w:t>FR-9</w:t>
             </w:r>
           </w:p>
         </w:tc>
         <w:tc>
           <w:tcPr>
             <w:tcW w:w="8000" w:type="dxa"/>
-            <w:tcMar>
-              <w:top w:w="80" w:type="dxa"/>
-              <w:left w:w="100" w:type="dxa"/>
-              <w:bottom w:w="80" w:type="dxa"/>
-              <w:right w:w="100" w:type="dxa"/>
-            </w:tcMar>
-            <w:vAlign w:val="center"/>
-          </w:tcPr>
-          <w:p>
-            <w:r>
-              <w:t>Allow sellers to view and manage incoming orders for their listings.</w:t>
+            <w:vAlign w:val="center"/>
+          </w:tcPr>
+          <w:p>
+            <w:pPr>
+              <w:spacing w:before="0" w:after="0" w:line="240" w:lineRule="auto"/>
+            </w:pPr>
+            <w:r>
+              <w:t>Allow buyers to track order status (placed, shipped, out for delivery, delivered).</w:t>
             </w:r>
           </w:p>
         </w:tc>
@@ -630,44 +589,39 @@
             <w:bottom w:w="0" w:type="dxa"/>
           </w:tblCellMar>
         </w:tblPrEx>
+        <w:trPr>
+          <w:cantSplit/>
+        </w:trPr>
         <w:tc>
           <w:tcPr>
             <w:tcW w:w="1400" w:type="dxa"/>
-            <w:tcMar>
-              <w:top w:w="80" w:type="dxa"/>
-              <w:left w:w="100" w:type="dxa"/>
-              <w:bottom w:w="80" w:type="dxa"/>
-              <w:right w:w="100" w:type="dxa"/>
-            </w:tcMar>
-            <w:vAlign w:val="center"/>
-          </w:tcPr>
-          <w:p>
-            <w:pPr>
-              <w:jc w:val="center"/>
-            </w:pPr>
-            <w:r>
-              <w:rPr>
-                <w:b/>
-                <w:bCs/>
-              </w:rPr>
-              <w:t>FR-9</w:t>
+            <w:vAlign w:val="center"/>
+          </w:tcPr>
+          <w:p>
+            <w:pPr>
+              <w:spacing w:before="0" w:after="0" w:line="240" w:lineRule="auto"/>
+              <w:jc w:val="center"/>
+            </w:pPr>
+            <w:r>
+              <w:rPr>
+                <w:b/>
+                <w:bCs/>
+              </w:rPr>
+              <w:t>FR-10</w:t>
             </w:r>
           </w:p>
         </w:tc>
         <w:tc>
           <w:tcPr>
             <w:tcW w:w="8000" w:type="dxa"/>
-            <w:tcMar>
-              <w:top w:w="80" w:type="dxa"/>
-              <w:left w:w="100" w:type="dxa"/>
-              <w:bottom w:w="80" w:type="dxa"/>
-              <w:right w:w="100" w:type="dxa"/>
-            </w:tcMar>
-            <w:vAlign w:val="center"/>
-          </w:tcPr>
-          <w:p>
-            <w:r>
-              <w:t>Allow buyers to track order status (placed, shipped, out for delivery, delivered).</w:t>
+            <w:vAlign w:val="center"/>
+          </w:tcPr>
+          <w:p>
+            <w:pPr>
+              <w:spacing w:before="0" w:after="0" w:line="240" w:lineRule="auto"/>
+            </w:pPr>
+            <w:r>
+              <w:t>Allow buyers to rate and review purchased books.</w:t>
             </w:r>
           </w:p>
         </w:tc>
@@ -679,44 +633,39 @@
             <w:bottom w:w="0" w:type="dxa"/>
           </w:tblCellMar>
         </w:tblPrEx>
+        <w:trPr>
+          <w:cantSplit/>
+        </w:trPr>
         <w:tc>
           <w:tcPr>
             <w:tcW w:w="1400" w:type="dxa"/>
-            <w:tcMar>
-              <w:top w:w="80" w:type="dxa"/>
-              <w:left w:w="100" w:type="dxa"/>
-              <w:bottom w:w="80" w:type="dxa"/>
-              <w:right w:w="100" w:type="dxa"/>
-            </w:tcMar>
-            <w:vAlign w:val="center"/>
-          </w:tcPr>
-          <w:p>
-            <w:pPr>
-              <w:jc w:val="center"/>
-            </w:pPr>
-            <w:r>
-              <w:rPr>
-                <w:b/>
-                <w:bCs/>
-              </w:rPr>
-              <w:t>FR-10</w:t>
+            <w:vAlign w:val="center"/>
+          </w:tcPr>
+          <w:p>
+            <w:pPr>
+              <w:spacing w:before="0" w:after="0" w:line="240" w:lineRule="auto"/>
+              <w:jc w:val="center"/>
+            </w:pPr>
+            <w:r>
+              <w:rPr>
+                <w:b/>
+                <w:bCs/>
+              </w:rPr>
+              <w:t>FR-11</w:t>
             </w:r>
           </w:p>
         </w:tc>
         <w:tc>
           <w:tcPr>
             <w:tcW w:w="8000" w:type="dxa"/>
-            <w:tcMar>
-              <w:top w:w="80" w:type="dxa"/>
-              <w:left w:w="100" w:type="dxa"/>
-              <w:bottom w:w="80" w:type="dxa"/>
-              <w:right w:w="100" w:type="dxa"/>
-            </w:tcMar>
-            <w:vAlign w:val="center"/>
-          </w:tcPr>
-          <w:p>
-            <w:r>
-              <w:t>Allow buyers to rate and review purchased books.</w:t>
+            <w:vAlign w:val="center"/>
+          </w:tcPr>
+          <w:p>
+            <w:pPr>
+              <w:spacing w:before="0" w:after="0" w:line="240" w:lineRule="auto"/>
+            </w:pPr>
+            <w:r>
+              <w:t>Allow buyers to apply discount codes/coupons at checkout.</w:t>
             </w:r>
           </w:p>
         </w:tc>
@@ -728,44 +677,39 @@
             <w:bottom w:w="0" w:type="dxa"/>
           </w:tblCellMar>
         </w:tblPrEx>
+        <w:trPr>
+          <w:cantSplit/>
+        </w:trPr>
         <w:tc>
           <w:tcPr>
             <w:tcW w:w="1400" w:type="dxa"/>
-            <w:tcMar>
-              <w:top w:w="80" w:type="dxa"/>
-              <w:left w:w="100" w:type="dxa"/>
-              <w:bottom w:w="80" w:type="dxa"/>
-              <w:right w:w="100" w:type="dxa"/>
-            </w:tcMar>
-            <w:vAlign w:val="center"/>
-          </w:tcPr>
-          <w:p>
-            <w:pPr>
-              <w:jc w:val="center"/>
-            </w:pPr>
-            <w:r>
-              <w:rPr>
-                <w:b/>
-                <w:bCs/>
-              </w:rPr>
-              <w:t>FR-11</w:t>
+            <w:vAlign w:val="center"/>
+          </w:tcPr>
+          <w:p>
+            <w:pPr>
+              <w:spacing w:before="0" w:after="0" w:line="240" w:lineRule="auto"/>
+              <w:jc w:val="center"/>
+            </w:pPr>
+            <w:r>
+              <w:rPr>
+                <w:b/>
+                <w:bCs/>
+              </w:rPr>
+              <w:t>FR-12</w:t>
             </w:r>
           </w:p>
         </w:tc>
         <w:tc>
           <w:tcPr>
             <w:tcW w:w="8000" w:type="dxa"/>
-            <w:tcMar>
-              <w:top w:w="80" w:type="dxa"/>
-              <w:left w:w="100" w:type="dxa"/>
-              <w:bottom w:w="80" w:type="dxa"/>
-              <w:right w:w="100" w:type="dxa"/>
-            </w:tcMar>
-            <w:vAlign w:val="center"/>
-          </w:tcPr>
-          <w:p>
-            <w:r>
-              <w:t>Allow buyers to apply discount codes/coupons at checkout.</w:t>
+            <w:vAlign w:val="center"/>
+          </w:tcPr>
+          <w:p>
+            <w:pPr>
+              <w:spacing w:before="0" w:after="0" w:line="240" w:lineRule="auto"/>
+            </w:pPr>
+            <w:r>
+              <w:t>Allow admins to approve, suspend, or remove listings and user accounts.</w:t>
             </w:r>
           </w:p>
         </w:tc>
@@ -777,44 +721,39 @@
             <w:bottom w:w="0" w:type="dxa"/>
           </w:tblCellMar>
         </w:tblPrEx>
+        <w:trPr>
+          <w:cantSplit/>
+        </w:trPr>
         <w:tc>
           <w:tcPr>
             <w:tcW w:w="1400" w:type="dxa"/>
-            <w:tcMar>
-              <w:top w:w="80" w:type="dxa"/>
-              <w:left w:w="100" w:type="dxa"/>
-              <w:bottom w:w="80" w:type="dxa"/>
-              <w:right w:w="100" w:type="dxa"/>
-            </w:tcMar>
-            <w:vAlign w:val="center"/>
-          </w:tcPr>
-          <w:p>
-            <w:pPr>
-              <w:jc w:val="center"/>
-            </w:pPr>
-            <w:r>
-              <w:rPr>
-                <w:b/>
-                <w:bCs/>
-              </w:rPr>
-              <w:t>FR-12</w:t>
+            <w:vAlign w:val="center"/>
+          </w:tcPr>
+          <w:p>
+            <w:pPr>
+              <w:spacing w:before="0" w:after="0" w:line="240" w:lineRule="auto"/>
+              <w:jc w:val="center"/>
+            </w:pPr>
+            <w:r>
+              <w:rPr>
+                <w:b/>
+                <w:bCs/>
+              </w:rPr>
+              <w:t>FR-13</w:t>
             </w:r>
           </w:p>
         </w:tc>
         <w:tc>
           <w:tcPr>
             <w:tcW w:w="8000" w:type="dxa"/>
-            <w:tcMar>
-              <w:top w:w="80" w:type="dxa"/>
-              <w:left w:w="100" w:type="dxa"/>
-              <w:bottom w:w="80" w:type="dxa"/>
-              <w:right w:w="100" w:type="dxa"/>
-            </w:tcMar>
-            <w:vAlign w:val="center"/>
-          </w:tcPr>
-          <w:p>
-            <w:r>
-              <w:t>Allow admins to approve, suspend, or remove listings and user accounts.</w:t>
+            <w:vAlign w:val="center"/>
+          </w:tcPr>
+          <w:p>
+            <w:pPr>
+              <w:spacing w:before="0" w:after="0" w:line="240" w:lineRule="auto"/>
+            </w:pPr>
+            <w:r>
+              <w:t>Generate an order invoice/receipt after successful payment.</w:t>
             </w:r>
           </w:p>
         </w:tc>
@@ -826,44 +765,39 @@
             <w:bottom w:w="0" w:type="dxa"/>
           </w:tblCellMar>
         </w:tblPrEx>
+        <w:trPr>
+          <w:cantSplit/>
+        </w:trPr>
         <w:tc>
           <w:tcPr>
             <w:tcW w:w="1400" w:type="dxa"/>
-            <w:tcMar>
-              <w:top w:w="80" w:type="dxa"/>
-              <w:left w:w="100" w:type="dxa"/>
-              <w:bottom w:w="80" w:type="dxa"/>
-              <w:right w:w="100" w:type="dxa"/>
-            </w:tcMar>
-            <w:vAlign w:val="center"/>
-          </w:tcPr>
-          <w:p>
-            <w:pPr>
-              <w:jc w:val="center"/>
-            </w:pPr>
-            <w:r>
-              <w:rPr>
-                <w:b/>
-                <w:bCs/>
-              </w:rPr>
-              <w:t>FR-13</w:t>
+            <w:vAlign w:val="center"/>
+          </w:tcPr>
+          <w:p>
+            <w:pPr>
+              <w:spacing w:before="0" w:after="0" w:line="240" w:lineRule="auto"/>
+              <w:jc w:val="center"/>
+            </w:pPr>
+            <w:r>
+              <w:rPr>
+                <w:b/>
+                <w:bCs/>
+              </w:rPr>
+              <w:t>FR-14</w:t>
             </w:r>
           </w:p>
         </w:tc>
         <w:tc>
           <w:tcPr>
             <w:tcW w:w="8000" w:type="dxa"/>
-            <w:tcMar>
-              <w:top w:w="80" w:type="dxa"/>
-              <w:left w:w="100" w:type="dxa"/>
-              <w:bottom w:w="80" w:type="dxa"/>
-              <w:right w:w="100" w:type="dxa"/>
-            </w:tcMar>
-            <w:vAlign w:val="center"/>
-          </w:tcPr>
-          <w:p>
-            <w:r>
-              <w:t>Generate an order invoice/receipt after successful payment.</w:t>
+            <w:vAlign w:val="center"/>
+          </w:tcPr>
+          <w:p>
+            <w:pPr>
+              <w:spacing w:before="0" w:after="0" w:line="240" w:lineRule="auto"/>
+            </w:pPr>
+            <w:r>
+              <w:t>Allow users to reset a forgotten password via email/OTP verification.</w:t>
             </w:r>
           </w:p>
         </w:tc>
@@ -875,91 +809,37 @@
             <w:bottom w:w="0" w:type="dxa"/>
           </w:tblCellMar>
         </w:tblPrEx>
+        <w:trPr>
+          <w:cantSplit/>
+        </w:trPr>
         <w:tc>
           <w:tcPr>
             <w:tcW w:w="1400" w:type="dxa"/>
-            <w:tcMar>
-              <w:top w:w="80" w:type="dxa"/>
-              <w:left w:w="100" w:type="dxa"/>
-              <w:bottom w:w="80" w:type="dxa"/>
-              <w:right w:w="100" w:type="dxa"/>
-            </w:tcMar>
-            <w:vAlign w:val="center"/>
-          </w:tcPr>
-          <w:p>
-            <w:pPr>
-              <w:jc w:val="center"/>
-            </w:pPr>
-            <w:r>
-              <w:rPr>
-                <w:b/>
-                <w:bCs/>
-              </w:rPr>
-              <w:t>FR-14</w:t>
+            <w:vAlign w:val="center"/>
+          </w:tcPr>
+          <w:p>
+            <w:pPr>
+              <w:spacing w:before="0" w:after="0" w:line="240" w:lineRule="auto"/>
+              <w:jc w:val="center"/>
+            </w:pPr>
+            <w:r>
+              <w:rPr>
+                <w:b/>
+                <w:bCs/>
+              </w:rPr>
+              <w:t>FR-15</w:t>
             </w:r>
           </w:p>
         </w:tc>
         <w:tc>
           <w:tcPr>
             <w:tcW w:w="8000" w:type="dxa"/>
-            <w:tcMar>
-              <w:top w:w="80" w:type="dxa"/>
-              <w:left w:w="100" w:type="dxa"/>
-              <w:bottom w:w="80" w:type="dxa"/>
-              <w:right w:w="100" w:type="dxa"/>
-            </w:tcMar>
-            <w:vAlign w:val="center"/>
-          </w:tcPr>
-          <w:p>
-            <w:r>
-              <w:t>Allow users to reset a forgotten password via email/OTP verification.</w:t>
-            </w:r>
-          </w:p>
-        </w:tc>
-      </w:tr>
-      <w:tr>
-        <w:tblPrEx>
-          <w:tblCellMar>
-            <w:top w:w="0" w:type="dxa"/>
-            <w:bottom w:w="0" w:type="dxa"/>
-          </w:tblCellMar>
-        </w:tblPrEx>
-        <w:tc>
-          <w:tcPr>
-            <w:tcW w:w="1400" w:type="dxa"/>
-            <w:tcMar>
-              <w:top w:w="80" w:type="dxa"/>
-              <w:left w:w="100" w:type="dxa"/>
-              <w:bottom w:w="80" w:type="dxa"/>
-              <w:right w:w="100" w:type="dxa"/>
-            </w:tcMar>
-            <w:vAlign w:val="center"/>
-          </w:tcPr>
-          <w:p>
-            <w:pPr>
-              <w:jc w:val="center"/>
-            </w:pPr>
-            <w:r>
-              <w:rPr>
-                <w:b/>
-                <w:bCs/>
-              </w:rPr>
-              <w:t>FR-15</w:t>
-            </w:r>
-          </w:p>
-        </w:tc>
-        <w:tc>
-          <w:tcPr>
-            <w:tcW w:w="8000" w:type="dxa"/>
-            <w:tcMar>
-              <w:top w:w="80" w:type="dxa"/>
-              <w:left w:w="100" w:type="dxa"/>
-              <w:bottom w:w="80" w:type="dxa"/>
-              <w:right w:w="100" w:type="dxa"/>
-            </w:tcMar>
-            <w:vAlign w:val="center"/>
-          </w:tcPr>
-          <w:p>
+            <w:vAlign w:val="center"/>
+          </w:tcPr>
+          <w:p>
+            <w:pPr>
+              <w:spacing w:before="0" w:after="0" w:line="240" w:lineRule="auto"/>
+            </w:pPr>
             <w:r>
               <w:t>Maintain a wishlist feature allowing buyers to save books for later.</w:t>
             </w:r>
@@ -1024,18 +904,22 @@
     </w:p>
     <w:tbl>
       <w:tblPr>
+        <w:tblStyle w:val="TableGrid"/>
         <w:tblW w:w="9400" w:type="dxa"/>
         <w:tblBorders>
-          <w:top w:val="single" w:sz="4" w:space="0" w:color="auto"/>
-          <w:left w:val="single" w:sz="4" w:space="0" w:color="auto"/>
-          <w:bottom w:val="single" w:sz="4" w:space="0" w:color="auto"/>
-          <w:right w:val="single" w:sz="4" w:space="0" w:color="auto"/>
-          <w:insideH w:val="single" w:sz="4" w:space="0" w:color="auto"/>
-          <w:insideV w:val="single" w:sz="4" w:space="0" w:color="auto"/>
+          <w:top w:val="single" w:sz="6" w:space="0" w:color="000000"/>
+          <w:left w:val="single" w:sz="6" w:space="0" w:color="000000"/>
+          <w:bottom w:val="single" w:sz="6" w:space="0" w:color="000000"/>
+          <w:right w:val="single" w:sz="6" w:space="0" w:color="000000"/>
+          <w:insideH w:val="single" w:sz="6" w:space="0" w:color="000000"/>
+          <w:insideV w:val="single" w:sz="6" w:space="0" w:color="000000"/>
         </w:tblBorders>
+        <w:tblLayout w:type="fixed"/>
         <w:tblCellMar>
-          <w:left w:w="10" w:type="dxa"/>
-          <w:right w:w="10" w:type="dxa"/>
+          <w:top w:w="60" w:type="dxa"/>
+          <w:left w:w="100" w:type="dxa"/>
+          <w:bottom w:w="60" w:type="dxa"/>
+          <w:right w:w="100" w:type="dxa"/>
         </w:tblCellMar>
         <w:tblLook w:val="0000" w:firstRow="0" w:lastRow="0" w:firstColumn="0" w:lastColumn="0" w:noHBand="0" w:noVBand="0"/>
       </w:tblPr>
@@ -1052,21 +936,18 @@
           </w:tblCellMar>
         </w:tblPrEx>
         <w:trPr>
+          <w:cantSplit/>
           <w:tblHeader/>
         </w:trPr>
         <w:tc>
           <w:tcPr>
             <w:tcW w:w="1300" w:type="dxa"/>
-            <w:tcMar>
-              <w:top w:w="80" w:type="dxa"/>
-              <w:left w:w="100" w:type="dxa"/>
-              <w:bottom w:w="80" w:type="dxa"/>
-              <w:right w:w="100" w:type="dxa"/>
-            </w:tcMar>
-            <w:vAlign w:val="center"/>
-          </w:tcPr>
-          <w:p>
-            <w:pPr>
+            <w:shd w:val="clear" w:color="auto" w:fill="D9D9D9"/>
+            <w:vAlign w:val="center"/>
+          </w:tcPr>
+          <w:p>
+            <w:pPr>
+              <w:spacing w:before="0" w:after="0" w:line="240" w:lineRule="auto"/>
               <w:jc w:val="center"/>
             </w:pPr>
             <w:r>
@@ -1082,16 +963,12 @@
         <w:tc>
           <w:tcPr>
             <w:tcW w:w="2200" w:type="dxa"/>
-            <w:tcMar>
-              <w:top w:w="80" w:type="dxa"/>
-              <w:left w:w="100" w:type="dxa"/>
-              <w:bottom w:w="80" w:type="dxa"/>
-              <w:right w:w="100" w:type="dxa"/>
-            </w:tcMar>
-            <w:vAlign w:val="center"/>
-          </w:tcPr>
-          <w:p>
-            <w:pPr>
+            <w:shd w:val="clear" w:color="auto" w:fill="D9D9D9"/>
+            <w:vAlign w:val="center"/>
+          </w:tcPr>
+          <w:p>
+            <w:pPr>
+              <w:spacing w:before="0" w:after="0" w:line="240" w:lineRule="auto"/>
               <w:jc w:val="center"/>
             </w:pPr>
             <w:r>
@@ -1106,16 +983,12 @@
         <w:tc>
           <w:tcPr>
             <w:tcW w:w="5900" w:type="dxa"/>
-            <w:tcMar>
-              <w:top w:w="80" w:type="dxa"/>
-              <w:left w:w="100" w:type="dxa"/>
-              <w:bottom w:w="80" w:type="dxa"/>
-              <w:right w:w="100" w:type="dxa"/>
-            </w:tcMar>
-            <w:vAlign w:val="center"/>
-          </w:tcPr>
-          <w:p>
-            <w:pPr>
+            <w:shd w:val="clear" w:color="auto" w:fill="D9D9D9"/>
+            <w:vAlign w:val="center"/>
+          </w:tcPr>
+          <w:p>
+            <w:pPr>
+              <w:spacing w:before="0" w:after="0" w:line="240" w:lineRule="auto"/>
               <w:jc w:val="center"/>
             </w:pPr>
             <w:r>
@@ -1135,19 +1008,17 @@
             <w:bottom w:w="0" w:type="dxa"/>
           </w:tblCellMar>
         </w:tblPrEx>
+        <w:trPr>
+          <w:cantSplit/>
+        </w:trPr>
         <w:tc>
           <w:tcPr>
             <w:tcW w:w="1300" w:type="dxa"/>
-            <w:tcMar>
-              <w:top w:w="80" w:type="dxa"/>
-              <w:left w:w="100" w:type="dxa"/>
-              <w:bottom w:w="80" w:type="dxa"/>
-              <w:right w:w="100" w:type="dxa"/>
-            </w:tcMar>
-            <w:vAlign w:val="center"/>
-          </w:tcPr>
-          <w:p>
-            <w:pPr>
+            <w:vAlign w:val="center"/>
+          </w:tcPr>
+          <w:p>
+            <w:pPr>
+              <w:spacing w:before="0" w:after="0" w:line="240" w:lineRule="auto"/>
               <w:jc w:val="center"/>
             </w:pPr>
             <w:r>
@@ -1162,15 +1033,12 @@
         <w:tc>
           <w:tcPr>
             <w:tcW w:w="2200" w:type="dxa"/>
-            <w:tcMar>
-              <w:top w:w="80" w:type="dxa"/>
-              <w:left w:w="100" w:type="dxa"/>
-              <w:bottom w:w="80" w:type="dxa"/>
-              <w:right w:w="100" w:type="dxa"/>
-            </w:tcMar>
-            <w:vAlign w:val="center"/>
-          </w:tcPr>
-          <w:p>
+            <w:vAlign w:val="center"/>
+          </w:tcPr>
+          <w:p>
+            <w:pPr>
+              <w:spacing w:before="0" w:after="0" w:line="240" w:lineRule="auto"/>
+            </w:pPr>
             <w:r>
               <w:t>Performance</w:t>
             </w:r>
@@ -1179,15 +1047,12 @@
         <w:tc>
           <w:tcPr>
             <w:tcW w:w="5900" w:type="dxa"/>
-            <w:tcMar>
-              <w:top w:w="80" w:type="dxa"/>
-              <w:left w:w="100" w:type="dxa"/>
-              <w:bottom w:w="80" w:type="dxa"/>
-              <w:right w:w="100" w:type="dxa"/>
-            </w:tcMar>
-            <w:vAlign w:val="center"/>
-          </w:tcPr>
-          <w:p>
+            <w:vAlign w:val="center"/>
+          </w:tcPr>
+          <w:p>
+            <w:pPr>
+              <w:spacing w:before="0" w:after="0" w:line="240" w:lineRule="auto"/>
+            </w:pPr>
             <w:r>
               <w:t>Page load time shall not exceed 2 seconds under normal load (up to 500 concurrent users).</w:t>
             </w:r>
@@ -1201,19 +1066,17 @@
             <w:bottom w:w="0" w:type="dxa"/>
           </w:tblCellMar>
         </w:tblPrEx>
+        <w:trPr>
+          <w:cantSplit/>
+        </w:trPr>
         <w:tc>
           <w:tcPr>
             <w:tcW w:w="1300" w:type="dxa"/>
-            <w:tcMar>
-              <w:top w:w="80" w:type="dxa"/>
-              <w:left w:w="100" w:type="dxa"/>
-              <w:bottom w:w="80" w:type="dxa"/>
-              <w:right w:w="100" w:type="dxa"/>
-            </w:tcMar>
-            <w:vAlign w:val="center"/>
-          </w:tcPr>
-          <w:p>
-            <w:pPr>
+            <w:vAlign w:val="center"/>
+          </w:tcPr>
+          <w:p>
+            <w:pPr>
+              <w:spacing w:before="0" w:after="0" w:line="240" w:lineRule="auto"/>
               <w:jc w:val="center"/>
             </w:pPr>
             <w:r>
@@ -1228,15 +1091,12 @@
         <w:tc>
           <w:tcPr>
             <w:tcW w:w="2200" w:type="dxa"/>
-            <w:tcMar>
-              <w:top w:w="80" w:type="dxa"/>
-              <w:left w:w="100" w:type="dxa"/>
-              <w:bottom w:w="80" w:type="dxa"/>
-              <w:right w:w="100" w:type="dxa"/>
-            </w:tcMar>
-            <w:vAlign w:val="center"/>
-          </w:tcPr>
-          <w:p>
+            <w:vAlign w:val="center"/>
+          </w:tcPr>
+          <w:p>
+            <w:pPr>
+              <w:spacing w:before="0" w:after="0" w:line="240" w:lineRule="auto"/>
+            </w:pPr>
             <w:r>
               <w:t>Reliability</w:t>
             </w:r>
@@ -1245,15 +1105,12 @@
         <w:tc>
           <w:tcPr>
             <w:tcW w:w="5900" w:type="dxa"/>
-            <w:tcMar>
-              <w:top w:w="80" w:type="dxa"/>
-              <w:left w:w="100" w:type="dxa"/>
-              <w:bottom w:w="80" w:type="dxa"/>
-              <w:right w:w="100" w:type="dxa"/>
-            </w:tcMar>
-            <w:vAlign w:val="center"/>
-          </w:tcPr>
-          <w:p>
+            <w:vAlign w:val="center"/>
+          </w:tcPr>
+          <w:p>
+            <w:pPr>
+              <w:spacing w:before="0" w:after="0" w:line="240" w:lineRule="auto"/>
+            </w:pPr>
             <w:r>
               <w:t>The system shall maintain 99.5% uptime, measured monthly.</w:t>
             </w:r>
@@ -1267,19 +1124,17 @@
             <w:bottom w:w="0" w:type="dxa"/>
           </w:tblCellMar>
         </w:tblPrEx>
+        <w:trPr>
+          <w:cantSplit/>
+        </w:trPr>
         <w:tc>
           <w:tcPr>
             <w:tcW w:w="1300" w:type="dxa"/>
-            <w:tcMar>
-              <w:top w:w="80" w:type="dxa"/>
-              <w:left w:w="100" w:type="dxa"/>
-              <w:bottom w:w="80" w:type="dxa"/>
-              <w:right w:w="100" w:type="dxa"/>
-            </w:tcMar>
-            <w:vAlign w:val="center"/>
-          </w:tcPr>
-          <w:p>
-            <w:pPr>
+            <w:vAlign w:val="center"/>
+          </w:tcPr>
+          <w:p>
+            <w:pPr>
+              <w:spacing w:before="0" w:after="0" w:line="240" w:lineRule="auto"/>
               <w:jc w:val="center"/>
             </w:pPr>
             <w:r>
@@ -1294,15 +1149,12 @@
         <w:tc>
           <w:tcPr>
             <w:tcW w:w="2200" w:type="dxa"/>
-            <w:tcMar>
-              <w:top w:w="80" w:type="dxa"/>
-              <w:left w:w="100" w:type="dxa"/>
-              <w:bottom w:w="80" w:type="dxa"/>
-              <w:right w:w="100" w:type="dxa"/>
-            </w:tcMar>
-            <w:vAlign w:val="center"/>
-          </w:tcPr>
-          <w:p>
+            <w:vAlign w:val="center"/>
+          </w:tcPr>
+          <w:p>
+            <w:pPr>
+              <w:spacing w:before="0" w:after="0" w:line="240" w:lineRule="auto"/>
+            </w:pPr>
             <w:r>
               <w:t>Scalability</w:t>
             </w:r>
@@ -1311,15 +1163,12 @@
         <w:tc>
           <w:tcPr>
             <w:tcW w:w="5900" w:type="dxa"/>
-            <w:tcMar>
-              <w:top w:w="80" w:type="dxa"/>
-              <w:left w:w="100" w:type="dxa"/>
-              <w:bottom w:w="80" w:type="dxa"/>
-              <w:right w:w="100" w:type="dxa"/>
-            </w:tcMar>
-            <w:vAlign w:val="center"/>
-          </w:tcPr>
-          <w:p>
+            <w:vAlign w:val="center"/>
+          </w:tcPr>
+          <w:p>
+            <w:pPr>
+              <w:spacing w:before="0" w:after="0" w:line="240" w:lineRule="auto"/>
+            </w:pPr>
             <w:r>
               <w:t>Support horizontal scaling to accommodate seasonal spikes without redesign.</w:t>
             </w:r>
@@ -1333,19 +1182,17 @@
             <w:bottom w:w="0" w:type="dxa"/>
           </w:tblCellMar>
         </w:tblPrEx>
+        <w:trPr>
+          <w:cantSplit/>
+        </w:trPr>
         <w:tc>
           <w:tcPr>
             <w:tcW w:w="1300" w:type="dxa"/>
-            <w:tcMar>
-              <w:top w:w="80" w:type="dxa"/>
-              <w:left w:w="100" w:type="dxa"/>
-              <w:bottom w:w="80" w:type="dxa"/>
-              <w:right w:w="100" w:type="dxa"/>
-            </w:tcMar>
-            <w:vAlign w:val="center"/>
-          </w:tcPr>
-          <w:p>
-            <w:pPr>
+            <w:vAlign w:val="center"/>
+          </w:tcPr>
+          <w:p>
+            <w:pPr>
+              <w:spacing w:before="0" w:after="0" w:line="240" w:lineRule="auto"/>
               <w:jc w:val="center"/>
             </w:pPr>
             <w:r>
@@ -1360,15 +1207,12 @@
         <w:tc>
           <w:tcPr>
             <w:tcW w:w="2200" w:type="dxa"/>
-            <w:tcMar>
-              <w:top w:w="80" w:type="dxa"/>
-              <w:left w:w="100" w:type="dxa"/>
-              <w:bottom w:w="80" w:type="dxa"/>
-              <w:right w:w="100" w:type="dxa"/>
-            </w:tcMar>
-            <w:vAlign w:val="center"/>
-          </w:tcPr>
-          <w:p>
+            <w:vAlign w:val="center"/>
+          </w:tcPr>
+          <w:p>
+            <w:pPr>
+              <w:spacing w:before="0" w:after="0" w:line="240" w:lineRule="auto"/>
+            </w:pPr>
             <w:r>
               <w:t>Usability</w:t>
             </w:r>
@@ -1377,15 +1221,12 @@
         <w:tc>
           <w:tcPr>
             <w:tcW w:w="5900" w:type="dxa"/>
-            <w:tcMar>
-              <w:top w:w="80" w:type="dxa"/>
-              <w:left w:w="100" w:type="dxa"/>
-              <w:bottom w:w="80" w:type="dxa"/>
-              <w:right w:w="100" w:type="dxa"/>
-            </w:tcMar>
-            <w:vAlign w:val="center"/>
-          </w:tcPr>
-          <w:p>
+            <w:vAlign w:val="center"/>
+          </w:tcPr>
+          <w:p>
+            <w:pPr>
+              <w:spacing w:before="0" w:after="0" w:line="240" w:lineRule="auto"/>
+            </w:pPr>
             <w:r>
               <w:t>A first-time user shall complete a purchase within 5 minutes without external help.</w:t>
             </w:r>
@@ -1399,19 +1240,17 @@
             <w:bottom w:w="0" w:type="dxa"/>
           </w:tblCellMar>
         </w:tblPrEx>
+        <w:trPr>
+          <w:cantSplit/>
+        </w:trPr>
         <w:tc>
           <w:tcPr>
             <w:tcW w:w="1300" w:type="dxa"/>
-            <w:tcMar>
-              <w:top w:w="80" w:type="dxa"/>
-              <w:left w:w="100" w:type="dxa"/>
-              <w:bottom w:w="80" w:type="dxa"/>
-              <w:right w:w="100" w:type="dxa"/>
-            </w:tcMar>
-            <w:vAlign w:val="center"/>
-          </w:tcPr>
-          <w:p>
-            <w:pPr>
+            <w:vAlign w:val="center"/>
+          </w:tcPr>
+          <w:p>
+            <w:pPr>
+              <w:spacing w:before="0" w:after="0" w:line="240" w:lineRule="auto"/>
               <w:jc w:val="center"/>
             </w:pPr>
             <w:r>
@@ -1426,15 +1265,12 @@
         <w:tc>
           <w:tcPr>
             <w:tcW w:w="2200" w:type="dxa"/>
-            <w:tcMar>
-              <w:top w:w="80" w:type="dxa"/>
-              <w:left w:w="100" w:type="dxa"/>
-              <w:bottom w:w="80" w:type="dxa"/>
-              <w:right w:w="100" w:type="dxa"/>
-            </w:tcMar>
-            <w:vAlign w:val="center"/>
-          </w:tcPr>
-          <w:p>
+            <w:vAlign w:val="center"/>
+          </w:tcPr>
+          <w:p>
+            <w:pPr>
+              <w:spacing w:before="0" w:after="0" w:line="240" w:lineRule="auto"/>
+            </w:pPr>
             <w:r>
               <w:t>Portability</w:t>
             </w:r>
@@ -1443,15 +1279,12 @@
         <w:tc>
           <w:tcPr>
             <w:tcW w:w="5900" w:type="dxa"/>
-            <w:tcMar>
-              <w:top w:w="80" w:type="dxa"/>
-              <w:left w:w="100" w:type="dxa"/>
-              <w:bottom w:w="80" w:type="dxa"/>
-              <w:right w:w="100" w:type="dxa"/>
-            </w:tcMar>
-            <w:vAlign w:val="center"/>
-          </w:tcPr>
-          <w:p>
+            <w:vAlign w:val="center"/>
+          </w:tcPr>
+          <w:p>
+            <w:pPr>
+              <w:spacing w:before="0" w:after="0" w:line="240" w:lineRule="auto"/>
+            </w:pPr>
             <w:r>
               <w:t>Accessible via modern browsers (Chrome, Firefox, Safari, Edge) and responsive on mobile.</w:t>
             </w:r>
@@ -1465,19 +1298,17 @@
             <w:bottom w:w="0" w:type="dxa"/>
           </w:tblCellMar>
         </w:tblPrEx>
+        <w:trPr>
+          <w:cantSplit/>
+        </w:trPr>
         <w:tc>
           <w:tcPr>
             <w:tcW w:w="1300" w:type="dxa"/>
-            <w:tcMar>
-              <w:top w:w="80" w:type="dxa"/>
-              <w:left w:w="100" w:type="dxa"/>
-              <w:bottom w:w="80" w:type="dxa"/>
-              <w:right w:w="100" w:type="dxa"/>
-            </w:tcMar>
-            <w:vAlign w:val="center"/>
-          </w:tcPr>
-          <w:p>
-            <w:pPr>
+            <w:vAlign w:val="center"/>
+          </w:tcPr>
+          <w:p>
+            <w:pPr>
+              <w:spacing w:before="0" w:after="0" w:line="240" w:lineRule="auto"/>
               <w:jc w:val="center"/>
             </w:pPr>
             <w:r>
@@ -1492,15 +1323,12 @@
         <w:tc>
           <w:tcPr>
             <w:tcW w:w="2200" w:type="dxa"/>
-            <w:tcMar>
-              <w:top w:w="80" w:type="dxa"/>
-              <w:left w:w="100" w:type="dxa"/>
-              <w:bottom w:w="80" w:type="dxa"/>
-              <w:right w:w="100" w:type="dxa"/>
-            </w:tcMar>
-            <w:vAlign w:val="center"/>
-          </w:tcPr>
-          <w:p>
+            <w:vAlign w:val="center"/>
+          </w:tcPr>
+          <w:p>
+            <w:pPr>
+              <w:spacing w:before="0" w:after="0" w:line="240" w:lineRule="auto"/>
+            </w:pPr>
             <w:r>
               <w:t>Security</w:t>
             </w:r>
@@ -1509,15 +1337,12 @@
         <w:tc>
           <w:tcPr>
             <w:tcW w:w="5900" w:type="dxa"/>
-            <w:tcMar>
-              <w:top w:w="80" w:type="dxa"/>
-              <w:left w:w="100" w:type="dxa"/>
-              <w:bottom w:w="80" w:type="dxa"/>
-              <w:right w:w="100" w:type="dxa"/>
-            </w:tcMar>
-            <w:vAlign w:val="center"/>
-          </w:tcPr>
-          <w:p>
+            <w:vAlign w:val="center"/>
+          </w:tcPr>
+          <w:p>
+            <w:pPr>
+              <w:spacing w:before="0" w:after="0" w:line="240" w:lineRule="auto"/>
+            </w:pPr>
             <w:r>
               <w:t>All sensitive data (passwords, payment info) shall be encrypted in transit (TLS 1.2+) and at rest.</w:t>
             </w:r>
@@ -1551,18 +1376,22 @@
     </w:p>
     <w:tbl>
       <w:tblPr>
+        <w:tblStyle w:val="TableGrid"/>
         <w:tblW w:w="9400" w:type="dxa"/>
         <w:tblBorders>
-          <w:top w:val="single" w:sz="4" w:space="0" w:color="auto"/>
-          <w:left w:val="single" w:sz="4" w:space="0" w:color="auto"/>
-          <w:bottom w:val="single" w:sz="4" w:space="0" w:color="auto"/>
-          <w:right w:val="single" w:sz="4" w:space="0" w:color="auto"/>
-          <w:insideH w:val="single" w:sz="4" w:space="0" w:color="auto"/>
-          <w:insideV w:val="single" w:sz="4" w:space="0" w:color="auto"/>
+          <w:top w:val="single" w:sz="6" w:space="0" w:color="000000"/>
+          <w:left w:val="single" w:sz="6" w:space="0" w:color="000000"/>
+          <w:bottom w:val="single" w:sz="6" w:space="0" w:color="000000"/>
+          <w:right w:val="single" w:sz="6" w:space="0" w:color="000000"/>
+          <w:insideH w:val="single" w:sz="6" w:space="0" w:color="000000"/>
+          <w:insideV w:val="single" w:sz="6" w:space="0" w:color="000000"/>
         </w:tblBorders>
+        <w:tblLayout w:type="fixed"/>
         <w:tblCellMar>
-          <w:left w:w="10" w:type="dxa"/>
-          <w:right w:w="10" w:type="dxa"/>
+          <w:top w:w="60" w:type="dxa"/>
+          <w:left w:w="100" w:type="dxa"/>
+          <w:bottom w:w="60" w:type="dxa"/>
+          <w:right w:w="100" w:type="dxa"/>
         </w:tblCellMar>
         <w:tblLook w:val="0000" w:firstRow="0" w:lastRow="0" w:firstColumn="0" w:lastColumn="0" w:noHBand="0" w:noVBand="0"/>
       </w:tblPr>
@@ -1579,21 +1408,18 @@
           </w:tblCellMar>
         </w:tblPrEx>
         <w:trPr>
+          <w:cantSplit/>
           <w:tblHeader/>
         </w:trPr>
         <w:tc>
           <w:tcPr>
             <w:tcW w:w="1300" w:type="dxa"/>
-            <w:tcMar>
-              <w:top w:w="80" w:type="dxa"/>
-              <w:left w:w="100" w:type="dxa"/>
-              <w:bottom w:w="80" w:type="dxa"/>
-              <w:right w:w="100" w:type="dxa"/>
-            </w:tcMar>
-            <w:vAlign w:val="center"/>
-          </w:tcPr>
-          <w:p>
-            <w:pPr>
+            <w:shd w:val="clear" w:color="auto" w:fill="D9D9D9"/>
+            <w:vAlign w:val="center"/>
+          </w:tcPr>
+          <w:p>
+            <w:pPr>
+              <w:spacing w:before="0" w:after="0" w:line="240" w:lineRule="auto"/>
               <w:jc w:val="center"/>
             </w:pPr>
             <w:r>
@@ -1608,16 +1434,12 @@
         <w:tc>
           <w:tcPr>
             <w:tcW w:w="2200" w:type="dxa"/>
-            <w:tcMar>
-              <w:top w:w="80" w:type="dxa"/>
-              <w:left w:w="100" w:type="dxa"/>
-              <w:bottom w:w="80" w:type="dxa"/>
-              <w:right w:w="100" w:type="dxa"/>
-            </w:tcMar>
-            <w:vAlign w:val="center"/>
-          </w:tcPr>
-          <w:p>
-            <w:pPr>
+            <w:shd w:val="clear" w:color="auto" w:fill="D9D9D9"/>
+            <w:vAlign w:val="center"/>
+          </w:tcPr>
+          <w:p>
+            <w:pPr>
+              <w:spacing w:before="0" w:after="0" w:line="240" w:lineRule="auto"/>
               <w:jc w:val="center"/>
             </w:pPr>
             <w:r>
@@ -1632,16 +1454,12 @@
         <w:tc>
           <w:tcPr>
             <w:tcW w:w="5900" w:type="dxa"/>
-            <w:tcMar>
-              <w:top w:w="80" w:type="dxa"/>
-              <w:left w:w="100" w:type="dxa"/>
-              <w:bottom w:w="80" w:type="dxa"/>
-              <w:right w:w="100" w:type="dxa"/>
-            </w:tcMar>
-            <w:vAlign w:val="center"/>
-          </w:tcPr>
-          <w:p>
-            <w:pPr>
+            <w:shd w:val="clear" w:color="auto" w:fill="D9D9D9"/>
+            <w:vAlign w:val="center"/>
+          </w:tcPr>
+          <w:p>
+            <w:pPr>
+              <w:spacing w:before="0" w:after="0" w:line="240" w:lineRule="auto"/>
               <w:jc w:val="center"/>
             </w:pPr>
             <w:r>
@@ -1661,19 +1479,17 @@
             <w:bottom w:w="0" w:type="dxa"/>
           </w:tblCellMar>
         </w:tblPrEx>
+        <w:trPr>
+          <w:cantSplit/>
+        </w:trPr>
         <w:tc>
           <w:tcPr>
             <w:tcW w:w="1300" w:type="dxa"/>
-            <w:tcMar>
-              <w:top w:w="80" w:type="dxa"/>
-              <w:left w:w="100" w:type="dxa"/>
-              <w:bottom w:w="80" w:type="dxa"/>
-              <w:right w:w="100" w:type="dxa"/>
-            </w:tcMar>
-            <w:vAlign w:val="center"/>
-          </w:tcPr>
-          <w:p>
-            <w:pPr>
+            <w:vAlign w:val="center"/>
+          </w:tcPr>
+          <w:p>
+            <w:pPr>
+              <w:spacing w:before="0" w:after="0" w:line="240" w:lineRule="auto"/>
               <w:jc w:val="center"/>
             </w:pPr>
             <w:r>
@@ -1688,15 +1504,12 @@
         <w:tc>
           <w:tcPr>
             <w:tcW w:w="2200" w:type="dxa"/>
-            <w:tcMar>
-              <w:top w:w="80" w:type="dxa"/>
-              <w:left w:w="100" w:type="dxa"/>
-              <w:bottom w:w="80" w:type="dxa"/>
-              <w:right w:w="100" w:type="dxa"/>
-            </w:tcMar>
-            <w:vAlign w:val="center"/>
-          </w:tcPr>
-          <w:p>
+            <w:vAlign w:val="center"/>
+          </w:tcPr>
+          <w:p>
+            <w:pPr>
+              <w:spacing w:before="0" w:after="0" w:line="240" w:lineRule="auto"/>
+            </w:pPr>
             <w:r>
               <w:t>Process Standards</w:t>
             </w:r>
@@ -1705,15 +1518,12 @@
         <w:tc>
           <w:tcPr>
             <w:tcW w:w="5900" w:type="dxa"/>
-            <w:tcMar>
-              <w:top w:w="80" w:type="dxa"/>
-              <w:left w:w="100" w:type="dxa"/>
-              <w:bottom w:w="80" w:type="dxa"/>
-              <w:right w:w="100" w:type="dxa"/>
-            </w:tcMar>
-            <w:vAlign w:val="center"/>
-          </w:tcPr>
-          <w:p>
+            <w:vAlign w:val="center"/>
+          </w:tcPr>
+          <w:p>
+            <w:pPr>
+              <w:spacing w:before="0" w:after="0" w:line="240" w:lineRule="auto"/>
+            </w:pPr>
             <w:r>
               <w:t>Development shall follow Agile/Scrum with 2-week sprints and code review before merge.</w:t>
             </w:r>
@@ -1727,19 +1537,17 @@
             <w:bottom w:w="0" w:type="dxa"/>
           </w:tblCellMar>
         </w:tblPrEx>
+        <w:trPr>
+          <w:cantSplit/>
+        </w:trPr>
         <w:tc>
           <w:tcPr>
             <w:tcW w:w="1300" w:type="dxa"/>
-            <w:tcMar>
-              <w:top w:w="80" w:type="dxa"/>
-              <w:left w:w="100" w:type="dxa"/>
-              <w:bottom w:w="80" w:type="dxa"/>
-              <w:right w:w="100" w:type="dxa"/>
-            </w:tcMar>
-            <w:vAlign w:val="center"/>
-          </w:tcPr>
-          <w:p>
-            <w:pPr>
+            <w:vAlign w:val="center"/>
+          </w:tcPr>
+          <w:p>
+            <w:pPr>
+              <w:spacing w:before="0" w:after="0" w:line="240" w:lineRule="auto"/>
               <w:jc w:val="center"/>
             </w:pPr>
             <w:r>
@@ -1754,15 +1562,12 @@
         <w:tc>
           <w:tcPr>
             <w:tcW w:w="2200" w:type="dxa"/>
-            <w:tcMar>
-              <w:top w:w="80" w:type="dxa"/>
-              <w:left w:w="100" w:type="dxa"/>
-              <w:bottom w:w="80" w:type="dxa"/>
-              <w:right w:w="100" w:type="dxa"/>
-            </w:tcMar>
-            <w:vAlign w:val="center"/>
-          </w:tcPr>
-          <w:p>
+            <w:vAlign w:val="center"/>
+          </w:tcPr>
+          <w:p>
+            <w:pPr>
+              <w:spacing w:before="0" w:after="0" w:line="240" w:lineRule="auto"/>
+            </w:pPr>
             <w:r>
               <w:t>Implementation</w:t>
             </w:r>
@@ -1771,15 +1576,12 @@
         <w:tc>
           <w:tcPr>
             <w:tcW w:w="5900" w:type="dxa"/>
-            <w:tcMar>
-              <w:top w:w="80" w:type="dxa"/>
-              <w:left w:w="100" w:type="dxa"/>
-              <w:bottom w:w="80" w:type="dxa"/>
-              <w:right w:w="100" w:type="dxa"/>
-            </w:tcMar>
-            <w:vAlign w:val="center"/>
-          </w:tcPr>
-          <w:p>
+            <w:vAlign w:val="center"/>
+          </w:tcPr>
+          <w:p>
+            <w:pPr>
+              <w:spacing w:before="0" w:after="0" w:line="240" w:lineRule="auto"/>
+            </w:pPr>
             <w:r>
               <w:t>Backend shall use the team's chosen framework; database shall use SQL for transactional integrity.</w:t>
             </w:r>
@@ -1793,19 +1595,17 @@
             <w:bottom w:w="0" w:type="dxa"/>
           </w:tblCellMar>
         </w:tblPrEx>
+        <w:trPr>
+          <w:cantSplit/>
+        </w:trPr>
         <w:tc>
           <w:tcPr>
             <w:tcW w:w="1300" w:type="dxa"/>
-            <w:tcMar>
-              <w:top w:w="80" w:type="dxa"/>
-              <w:left w:w="100" w:type="dxa"/>
-              <w:bottom w:w="80" w:type="dxa"/>
-              <w:right w:w="100" w:type="dxa"/>
-            </w:tcMar>
-            <w:vAlign w:val="center"/>
-          </w:tcPr>
-          <w:p>
-            <w:pPr>
+            <w:vAlign w:val="center"/>
+          </w:tcPr>
+          <w:p>
+            <w:pPr>
+              <w:spacing w:before="0" w:after="0" w:line="240" w:lineRule="auto"/>
               <w:jc w:val="center"/>
             </w:pPr>
             <w:r>
@@ -1820,15 +1620,12 @@
         <w:tc>
           <w:tcPr>
             <w:tcW w:w="2200" w:type="dxa"/>
-            <w:tcMar>
-              <w:top w:w="80" w:type="dxa"/>
-              <w:left w:w="100" w:type="dxa"/>
-              <w:bottom w:w="80" w:type="dxa"/>
-              <w:right w:w="100" w:type="dxa"/>
-            </w:tcMar>
-            <w:vAlign w:val="center"/>
-          </w:tcPr>
-          <w:p>
+            <w:vAlign w:val="center"/>
+          </w:tcPr>
+          <w:p>
+            <w:pPr>
+              <w:spacing w:before="0" w:after="0" w:line="240" w:lineRule="auto"/>
+            </w:pPr>
             <w:r>
               <w:t>Maintainability</w:t>
             </w:r>
@@ -1837,15 +1634,12 @@
         <w:tc>
           <w:tcPr>
             <w:tcW w:w="5900" w:type="dxa"/>
-            <w:tcMar>
-              <w:top w:w="80" w:type="dxa"/>
-              <w:left w:w="100" w:type="dxa"/>
-              <w:bottom w:w="80" w:type="dxa"/>
-              <w:right w:w="100" w:type="dxa"/>
-            </w:tcMar>
-            <w:vAlign w:val="center"/>
-          </w:tcPr>
-          <w:p>
+            <w:vAlign w:val="center"/>
+          </w:tcPr>
+          <w:p>
+            <w:pPr>
+              <w:spacing w:before="0" w:after="0" w:line="240" w:lineRule="auto"/>
+            </w:pPr>
             <w:r>
               <w:t>Codebase shall maintain a minimum of 70% unit test coverage.</w:t>
             </w:r>
@@ -1879,18 +1673,22 @@
     </w:p>
     <w:tbl>
       <w:tblPr>
+        <w:tblStyle w:val="TableGrid"/>
         <w:tblW w:w="9400" w:type="dxa"/>
         <w:tblBorders>
-          <w:top w:val="single" w:sz="4" w:space="0" w:color="auto"/>
-          <w:left w:val="single" w:sz="4" w:space="0" w:color="auto"/>
-          <w:bottom w:val="single" w:sz="4" w:space="0" w:color="auto"/>
-          <w:right w:val="single" w:sz="4" w:space="0" w:color="auto"/>
-          <w:insideH w:val="single" w:sz="4" w:space="0" w:color="auto"/>
-          <w:insideV w:val="single" w:sz="4" w:space="0" w:color="auto"/>
+          <w:top w:val="single" w:sz="6" w:space="0" w:color="000000"/>
+          <w:left w:val="single" w:sz="6" w:space="0" w:color="000000"/>
+          <w:bottom w:val="single" w:sz="6" w:space="0" w:color="000000"/>
+          <w:right w:val="single" w:sz="6" w:space="0" w:color="000000"/>
+          <w:insideH w:val="single" w:sz="6" w:space="0" w:color="000000"/>
+          <w:insideV w:val="single" w:sz="6" w:space="0" w:color="000000"/>
         </w:tblBorders>
+        <w:tblLayout w:type="fixed"/>
         <w:tblCellMar>
-          <w:left w:w="10" w:type="dxa"/>
-          <w:right w:w="10" w:type="dxa"/>
+          <w:top w:w="60" w:type="dxa"/>
+          <w:left w:w="100" w:type="dxa"/>
+          <w:bottom w:w="60" w:type="dxa"/>
+          <w:right w:w="100" w:type="dxa"/>
         </w:tblCellMar>
         <w:tblLook w:val="0000" w:firstRow="0" w:lastRow="0" w:firstColumn="0" w:lastColumn="0" w:noHBand="0" w:noVBand="0"/>
       </w:tblPr>
@@ -1907,21 +1705,18 @@
           </w:tblCellMar>
         </w:tblPrEx>
         <w:trPr>
+          <w:cantSplit/>
           <w:tblHeader/>
         </w:trPr>
         <w:tc>
           <w:tcPr>
             <w:tcW w:w="1300" w:type="dxa"/>
-            <w:tcMar>
-              <w:top w:w="80" w:type="dxa"/>
-              <w:left w:w="100" w:type="dxa"/>
-              <w:bottom w:w="80" w:type="dxa"/>
-              <w:right w:w="100" w:type="dxa"/>
-            </w:tcMar>
-            <w:vAlign w:val="center"/>
-          </w:tcPr>
-          <w:p>
-            <w:pPr>
+            <w:shd w:val="clear" w:color="auto" w:fill="D9D9D9"/>
+            <w:vAlign w:val="center"/>
+          </w:tcPr>
+          <w:p>
+            <w:pPr>
+              <w:spacing w:before="0" w:after="0" w:line="240" w:lineRule="auto"/>
               <w:jc w:val="center"/>
             </w:pPr>
             <w:r>
@@ -1936,16 +1731,12 @@
         <w:tc>
           <w:tcPr>
             <w:tcW w:w="2200" w:type="dxa"/>
-            <w:tcMar>
-              <w:top w:w="80" w:type="dxa"/>
-              <w:left w:w="100" w:type="dxa"/>
-              <w:bottom w:w="80" w:type="dxa"/>
-              <w:right w:w="100" w:type="dxa"/>
-            </w:tcMar>
-            <w:vAlign w:val="center"/>
-          </w:tcPr>
-          <w:p>
-            <w:pPr>
+            <w:shd w:val="clear" w:color="auto" w:fill="D9D9D9"/>
+            <w:vAlign w:val="center"/>
+          </w:tcPr>
+          <w:p>
+            <w:pPr>
+              <w:spacing w:before="0" w:after="0" w:line="240" w:lineRule="auto"/>
               <w:jc w:val="center"/>
             </w:pPr>
             <w:r>
@@ -1960,16 +1751,12 @@
         <w:tc>
           <w:tcPr>
             <w:tcW w:w="5900" w:type="dxa"/>
-            <w:tcMar>
-              <w:top w:w="80" w:type="dxa"/>
-              <w:left w:w="100" w:type="dxa"/>
-              <w:bottom w:w="80" w:type="dxa"/>
-              <w:right w:w="100" w:type="dxa"/>
-            </w:tcMar>
-            <w:vAlign w:val="center"/>
-          </w:tcPr>
-          <w:p>
-            <w:pPr>
+            <w:shd w:val="clear" w:color="auto" w:fill="D9D9D9"/>
+            <w:vAlign w:val="center"/>
+          </w:tcPr>
+          <w:p>
+            <w:pPr>
+              <w:spacing w:before="0" w:after="0" w:line="240" w:lineRule="auto"/>
               <w:jc w:val="center"/>
             </w:pPr>
             <w:r>
@@ -1989,19 +1776,17 @@
             <w:bottom w:w="0" w:type="dxa"/>
           </w:tblCellMar>
         </w:tblPrEx>
+        <w:trPr>
+          <w:cantSplit/>
+        </w:trPr>
         <w:tc>
           <w:tcPr>
             <w:tcW w:w="1300" w:type="dxa"/>
-            <w:tcMar>
-              <w:top w:w="80" w:type="dxa"/>
-              <w:left w:w="100" w:type="dxa"/>
-              <w:bottom w:w="80" w:type="dxa"/>
-              <w:right w:w="100" w:type="dxa"/>
-            </w:tcMar>
-            <w:vAlign w:val="center"/>
-          </w:tcPr>
-          <w:p>
-            <w:pPr>
+            <w:vAlign w:val="center"/>
+          </w:tcPr>
+          <w:p>
+            <w:pPr>
+              <w:spacing w:before="0" w:after="0" w:line="240" w:lineRule="auto"/>
               <w:jc w:val="center"/>
             </w:pPr>
             <w:r>
@@ -2016,15 +1801,12 @@
         <w:tc>
           <w:tcPr>
             <w:tcW w:w="2200" w:type="dxa"/>
-            <w:tcMar>
-              <w:top w:w="80" w:type="dxa"/>
-              <w:left w:w="100" w:type="dxa"/>
-              <w:bottom w:w="80" w:type="dxa"/>
-              <w:right w:w="100" w:type="dxa"/>
-            </w:tcMar>
-            <w:vAlign w:val="center"/>
-          </w:tcPr>
-          <w:p>
+            <w:vAlign w:val="center"/>
+          </w:tcPr>
+          <w:p>
+            <w:pPr>
+              <w:spacing w:before="0" w:after="0" w:line="240" w:lineRule="auto"/>
+            </w:pPr>
             <w:r>
               <w:t>Legal/Regulatory</w:t>
             </w:r>
@@ -2033,15 +1815,12 @@
         <w:tc>
           <w:tcPr>
             <w:tcW w:w="5900" w:type="dxa"/>
-            <w:tcMar>
-              <w:top w:w="80" w:type="dxa"/>
-              <w:left w:w="100" w:type="dxa"/>
-              <w:bottom w:w="80" w:type="dxa"/>
-              <w:right w:w="100" w:type="dxa"/>
-            </w:tcMar>
-            <w:vAlign w:val="center"/>
-          </w:tcPr>
-          <w:p>
+            <w:vAlign w:val="center"/>
+          </w:tcPr>
+          <w:p>
+            <w:pPr>
+              <w:spacing w:before="0" w:after="0" w:line="240" w:lineRule="auto"/>
+            </w:pPr>
             <w:r>
               <w:t>The system shall comply with data protection laws applicable to the regions it serves.</w:t>
             </w:r>
@@ -2055,19 +1834,17 @@
             <w:bottom w:w="0" w:type="dxa"/>
           </w:tblCellMar>
         </w:tblPrEx>
+        <w:trPr>
+          <w:cantSplit/>
+        </w:trPr>
         <w:tc>
           <w:tcPr>
             <w:tcW w:w="1300" w:type="dxa"/>
-            <w:tcMar>
-              <w:top w:w="80" w:type="dxa"/>
-              <w:left w:w="100" w:type="dxa"/>
-              <w:bottom w:w="80" w:type="dxa"/>
-              <w:right w:w="100" w:type="dxa"/>
-            </w:tcMar>
-            <w:vAlign w:val="center"/>
-          </w:tcPr>
-          <w:p>
-            <w:pPr>
+            <w:vAlign w:val="center"/>
+          </w:tcPr>
+          <w:p>
+            <w:pPr>
+              <w:spacing w:before="0" w:after="0" w:line="240" w:lineRule="auto"/>
               <w:jc w:val="center"/>
             </w:pPr>
             <w:r>
@@ -2082,15 +1859,12 @@
         <w:tc>
           <w:tcPr>
             <w:tcW w:w="2200" w:type="dxa"/>
-            <w:tcMar>
-              <w:top w:w="80" w:type="dxa"/>
-              <w:left w:w="100" w:type="dxa"/>
-              <w:bottom w:w="80" w:type="dxa"/>
-              <w:right w:w="100" w:type="dxa"/>
-            </w:tcMar>
-            <w:vAlign w:val="center"/>
-          </w:tcPr>
-          <w:p>
+            <w:vAlign w:val="center"/>
+          </w:tcPr>
+          <w:p>
+            <w:pPr>
+              <w:spacing w:before="0" w:after="0" w:line="240" w:lineRule="auto"/>
+            </w:pPr>
             <w:r>
               <w:t>Interoperability</w:t>
             </w:r>
@@ -2099,15 +1873,12 @@
         <w:tc>
           <w:tcPr>
             <w:tcW w:w="5900" w:type="dxa"/>
-            <w:tcMar>
-              <w:top w:w="80" w:type="dxa"/>
-              <w:left w:w="100" w:type="dxa"/>
-              <w:bottom w:w="80" w:type="dxa"/>
-              <w:right w:w="100" w:type="dxa"/>
-            </w:tcMar>
-            <w:vAlign w:val="center"/>
-          </w:tcPr>
-          <w:p>
+            <w:vAlign w:val="center"/>
+          </w:tcPr>
+          <w:p>
+            <w:pPr>
+              <w:spacing w:before="0" w:after="0" w:line="240" w:lineRule="auto"/>
+            </w:pPr>
             <w:r>
               <w:t>Payment and shipping integrations shall use standard, documented third-party APIs.</w:t>
             </w:r>
@@ -2121,19 +1892,17 @@
             <w:bottom w:w="0" w:type="dxa"/>
           </w:tblCellMar>
         </w:tblPrEx>
+        <w:trPr>
+          <w:cantSplit/>
+        </w:trPr>
         <w:tc>
           <w:tcPr>
             <w:tcW w:w="1300" w:type="dxa"/>
-            <w:tcMar>
-              <w:top w:w="80" w:type="dxa"/>
-              <w:left w:w="100" w:type="dxa"/>
-              <w:bottom w:w="80" w:type="dxa"/>
-              <w:right w:w="100" w:type="dxa"/>
-            </w:tcMar>
-            <w:vAlign w:val="center"/>
-          </w:tcPr>
-          <w:p>
-            <w:pPr>
+            <w:vAlign w:val="center"/>
+          </w:tcPr>
+          <w:p>
+            <w:pPr>
+              <w:spacing w:before="0" w:after="0" w:line="240" w:lineRule="auto"/>
               <w:jc w:val="center"/>
             </w:pPr>
             <w:r>
@@ -2148,15 +1917,12 @@
         <w:tc>
           <w:tcPr>
             <w:tcW w:w="2200" w:type="dxa"/>
-            <w:tcMar>
-              <w:top w:w="80" w:type="dxa"/>
-              <w:left w:w="100" w:type="dxa"/>
-              <w:bottom w:w="80" w:type="dxa"/>
-              <w:right w:w="100" w:type="dxa"/>
-            </w:tcMar>
-            <w:vAlign w:val="center"/>
-          </w:tcPr>
-          <w:p>
+            <w:vAlign w:val="center"/>
+          </w:tcPr>
+          <w:p>
+            <w:pPr>
+              <w:spacing w:before="0" w:after="0" w:line="240" w:lineRule="auto"/>
+            </w:pPr>
             <w:r>
               <w:t>Availability</w:t>
             </w:r>
@@ -2165,15 +1931,12 @@
         <w:tc>
           <w:tcPr>
             <w:tcW w:w="5900" w:type="dxa"/>
-            <w:tcMar>
-              <w:top w:w="80" w:type="dxa"/>
-              <w:left w:w="100" w:type="dxa"/>
-              <w:bottom w:w="80" w:type="dxa"/>
-              <w:right w:w="100" w:type="dxa"/>
-            </w:tcMar>
-            <w:vAlign w:val="center"/>
-          </w:tcPr>
-          <w:p>
+            <w:vAlign w:val="center"/>
+          </w:tcPr>
+          <w:p>
+            <w:pPr>
+              <w:spacing w:before="0" w:after="0" w:line="240" w:lineRule="auto"/>
+            </w:pPr>
             <w:r>
               <w:t>Customer support channels (chat/email) shall respond within 24 hours.</w:t>
             </w:r>
@@ -2807,8 +2570,11 @@
       <w:outlineLvl w:val="0"/>
     </w:pPr>
     <w:rPr>
-      <w:color w:val="2E74B5"/>
-      <w:sz w:val="32"/>
+      <w:rFonts w:ascii="Times New Roman" w:hAnsi="Times New Roman" w:cs="Times New Roman" w:eastAsia="Times New Roman"/>
+      <w:b/>
+      <w:i w:val="0"/>
+      <w:color w:val="000000"/>
+      <w:sz w:val="28"/>
       <w:szCs w:val="32"/>
     </w:rPr>
   </w:style>
@@ -2821,8 +2587,11 @@
       <w:outlineLvl w:val="1"/>
     </w:pPr>
     <w:rPr>
-      <w:color w:val="2E74B5"/>
-      <w:sz w:val="26"/>
+      <w:rFonts w:ascii="Times New Roman" w:hAnsi="Times New Roman" w:cs="Times New Roman" w:eastAsia="Times New Roman"/>
+      <w:b/>
+      <w:i w:val="0"/>
+      <w:color w:val="000000"/>
+      <w:sz w:val="24"/>
       <w:szCs w:val="26"/>
     </w:rPr>
   </w:style>

</xml_diff>